<commit_message>
fix: constrain medium widget width and deliver 2.6.1
</commit_message>
<xml_diff>
--- a/docs/Income-per-sed（说明文档）.docx
+++ b/docs/Income-per-sed（说明文档）.docx
@@ -129,7 +129,7 @@
           </w:tcPr>
           <w:p>
             <w:r>
-              <w:t>产品版本 2.6.0 · 交付 20261007.1</w:t>
+              <w:t>产品版本 2.6.1 · 交付 20261008.1</w:t>
             </w:r>
           </w:p>
         </w:tc>
@@ -176,7 +176,7 @@
           </w:tcPr>
           <w:p>
             <w:r>
-              <w:t>v39-20261007.1</w:t>
+              <w:t>v39-20261008.1</w:t>
             </w:r>
           </w:p>
         </w:tc>
@@ -223,7 +223,7 @@
           </w:tcPr>
           <w:p>
             <w:r>
-              <w:t>20261007.1</w:t>
+              <w:t>20261008.1</w:t>
             </w:r>
           </w:p>
         </w:tc>
@@ -270,7 +270,7 @@
           </w:tcPr>
           <w:p>
             <w:r>
-              <w:t>2026-10-07</w:t>
+              <w:t>2026-10-08</w:t>
             </w:r>
           </w:p>
         </w:tc>
@@ -1160,7 +1160,7 @@
           </w:tcPr>
           <w:p>
             <w:r>
-              <w:t>手册 20261007.1：操作、排查与版本对应</w:t>
+              <w:t>手册 20261008.1：操作、排查与版本对应</w:t>
             </w:r>
           </w:p>
         </w:tc>
@@ -1236,7 +1236,7 @@
           </w:tcPr>
           <w:p>
             <w:r>
-              <w:t>小组件 2.6.0；独立 Scriptable 脚本</w:t>
+              <w:t>小组件 2.6.1；独立 Scriptable 脚本</w:t>
             </w:r>
           </w:p>
         </w:tc>
@@ -1367,7 +1367,7 @@
     </w:p>
     <w:p>
       <w:r>
-        <w:t>如何确认四个文件属于同一包：网页产品版本、小组件版本与手册适用版本均为 2.6.0，交付编号为 20261007.1。release-manifest.json 记录对应关系，SHA256SUMS.txt 对四个文件进行精确校验；交付编号用于区分同一产品版本的打包批次。</w:t>
+        <w:t>如何确认四个文件属于同一包：网页产品版本、小组件版本与手册适用版本均为 2.6.1，交付编号为 20261008.1。release-manifest.json 记录对应关系，SHA256SUMS.txt 对四个文件进行精确校验；交付编号用于区分同一产品版本的打包批次。</w:t>
       </w:r>
     </w:p>
     <w:p>
@@ -2608,7 +2608,7 @@
         <w:rPr>
           <w:sz w:val="22"/>
         </w:rPr>
-        <w:t>小、中、大号常规主数字统一使用 32 pt 圆润中等字重，金额单位为 22 pt 常规字重；单位与数字紧邻排列。长金额按可用宽度沿用紧凑整数与万／亿规则，单位同比适配。大号表盘为 96 pt，中号为 82 pt；大号内容保持居中，并使用淡色刻度进度轨道。预览菜单仅提供小、中、大号，不提供特大号入口。</w:t>
+        <w:t>小、中、大号常规主数字统一使用 32 pt 圆润中等字重，金额单位为 22 pt 常规字重；单位与数字紧邻排列。中号读数区为 199 pt，适配所测 329、342、400 pt 容器；长金额沿用紧凑整数与万／亿规则。大号表盘为 96 pt，中号为 82 pt；大号内容居中，使用淡色刻度进度轨道。预览菜单仅提供小、中、大号。</w:t>
       </w:r>
     </w:p>
     <w:p>
@@ -2728,7 +2728,7 @@
         <w:rPr>
           <w:sz w:val="22"/>
         </w:rPr>
-        <w:t>中号浅色与深色图片于 2026 年 10 月 7 日根据本次小组件源码生成，为桌面排版模拟，不是实体 iPhone 截图；系统圆润字体与原生排版仍以设备为准。</w:t>
+        <w:t>中号浅色与深色图片于 2026 年 10 月 7 日根据 2.6.0 小组件源码生成，为桌面排版模拟，不是实体 iPhone 截图；系统圆润字体与原生排版仍以设备为准。</w:t>
       </w:r>
     </w:p>
     <w:p>
@@ -14033,7 +14033,7 @@
         <w:spacing w:line="300" w:lineRule="auto" w:after="120"/>
       </w:pPr>
       <w:r>
-        <w:t>本次四文件版本统一为 2.6.0。小组件纳入已确认的三尺寸布局、状态图标、简短节点、日金与已工作切换、统一金额字重及单位间距，以及大号淡色刻度进度轨道。网页主表盘、数字滚轮、背景网格和主题切换保持不变。</w:t>
+        <w:t>本次四文件版本统一为 2.6.1。仅修复中号小组件在 329 pt 容器内的宽度越界；表盘、间距、常规金额字号及小号、大号布局保持不变。网页主表盘、数字滚轮、背景网格和主题切换保持不变。</w:t>
       </w:r>
     </w:p>
     <w:p>
@@ -14045,7 +14045,7 @@
         <w:rPr>
           <w:color w:val="202725"/>
         </w:rPr>
-        <w:t>2026 年 10 月 7 日交付更新</w:t>
+        <w:t>2026 年 10 月 8 日交付更新</w:t>
       </w:r>
     </w:p>
     <w:p>
@@ -14056,7 +14056,7 @@
         <w:rPr>
           <w:sz w:val="22"/>
         </w:rPr>
-        <w:t>产品版本 2.6.0 · 交付 20261007.1。Develop 是唯一网页源，Push 由现有构建流程生成。小组件保留正式设置菜单、配置校验、安全保存与配套网页入口，不使用只读预览的临时入口。说明书与校验清单同步更新。</w:t>
+        <w:t>产品版本 2.6.1 · 交付 20261008.1。Develop 是唯一网页源，Push 由现有构建流程生成。小组件保留正式设置菜单、配置校验、安全保存与配套网页入口，不使用只读预览的临时入口。说明书与校验清单同步更新。</w:t>
       </w:r>
     </w:p>
     <w:p>
@@ -14101,7 +14101,7 @@
         <w:rPr>
           <w:sz w:val="22"/>
         </w:rPr>
-        <w:t>本次小组件完成 200 个专项模拟布局检查，覆盖非零与长金额、万／亿边界、工作状态与底部基线，以及进度端点的几何和像素；未发现遮挡、越界或页面错误。正式文件另做版本、构建、存储与排版检查，结果以配套交付记录为准。浏览器模拟不等于实体设备或 VoiceOver 验收，真实跨夜验收继续暂停。</w:t>
+        <w:t>本次 13 项小组件配置与布局检查通过；84 组中号宽度、状态与金额模拟无越界或重叠，56 组小号、大号布局与修复前一致。所有小组件函数正文不变；网页仅更新版本元数据，未重跑 HTML 全套浏览器测试。模拟不等于实体设备验收，真实跨夜验收继续暂停。</w:t>
       </w:r>
     </w:p>
     <w:p>
@@ -14134,7 +14134,7 @@
         <w:rPr>
           <w:sz w:val="22"/>
         </w:rPr>
-        <w:t>第三章小组件图片已更新为本次源码生成的中号浅色与深色模拟图，业务时间为 2026-10-07 10:20。它们用于说明布局，不能替代实机或刷新调度验收。</w:t>
+        <w:t>第三章保留 2026 年 10 月 7 日按 2.6.0 源码生成的中号浅色与深色模拟图，业务时间为 2026-10-07 10:20；它们用于说明常规布局，不作为本次窄屏修复的实机验收证据。</w:t>
       </w:r>
     </w:p>
     <w:p>
@@ -14168,7 +14168,7 @@
         <w:rPr>
           <w:sz w:val="22"/>
         </w:rPr>
-        <w:t>用户已确认本次小组件预览的三尺寸零金额显示与单位间距。非零长金额、其他状态、进度端点和 iPad 的新增实机验收仍待确认；本轮未进行真实跨夜。网页参考图保留原始来源日期。</w:t>
+        <w:t>用户已确认此前小组件预览的三尺寸零金额显示与单位间距。本次中号窄屏修复、非零长金额及 iPad 实机验收仍待确认；本轮未进行真实跨夜。网页参考图保留原始来源日期。</w:t>
       </w:r>
     </w:p>
     <w:p>
@@ -14221,7 +14221,7 @@
         <w:rPr>
           <w:sz w:val="22"/>
         </w:rPr>
-        <w:t>DA9D1389841DF81989B215F2136DFC45B5168652AA478A9A4FB71B418EF8085D</w:t>
+        <w:t>646332BC34F9C2B1271FF2BFEEBCC0A695E545CD244310850CCCC35B98618E79</w:t>
       </w:r>
       <w:bookmarkEnd w:id="9000"/>
     </w:p>
@@ -14246,7 +14246,7 @@
         <w:rPr>
           <w:sz w:val="22"/>
         </w:rPr>
-        <w:t>21E20C1A41889126125E5584CF5B010C3B9C02F0BF5EC6579E8071548DFF3106</w:t>
+        <w:t>73AE078D3B99E99A04D21B7DEF4BE03E0B0C0D11B7734D9A644067D82372227E</w:t>
       </w:r>
       <w:bookmarkEnd w:id="9001"/>
     </w:p>
@@ -14271,7 +14271,7 @@
         <w:rPr>
           <w:sz w:val="22"/>
         </w:rPr>
-        <w:t>6498763CC55286289414AAD2CA58B729253D7F2A4E482F6F372F65642DBCD947</w:t>
+        <w:t>D9A7E8402C22D97FC8F2C55087FE84C80565C2090FEF6BED3DC7BB35ABF63FAA</w:t>
       </w:r>
       <w:bookmarkEnd w:id="9002"/>
     </w:p>

</xml_diff>

<commit_message>
chore: unify four-file delivery at version 2.7.0
</commit_message>
<xml_diff>
--- a/docs/Income-per-sed（说明文档）.docx
+++ b/docs/Income-per-sed（说明文档）.docx
@@ -12,7 +12,7 @@
     </w:p>
     <w:p>
       <w:r>
-        <w:t>产品版本 2.6.2-rc.47 · 交付 20261021.2</w:t>
+        <w:t>产品版本 2.7.0 · 交付 20261021.3</w:t>
       </w:r>
     </w:p>
     <w:p>
@@ -2060,7 +2060,7 @@
     </w:p>
     <w:p>
       <w:r>
-        <w:t>网页、小组件与本手册统一为 2.6.2-rc.47，交付 20261021.2。Develop 用于维护和诊断，日常使用 Push；Push 从 Develop 生成，不单独修改。精确校验还可查看同包的 SHA256SUMS.txt 与 release-manifest.json。</w:t>
+        <w:t>网页、小组件与本手册统一为 2.7.0，交付 20261021.3。Develop 用于维护和诊断，日常使用 Push；Push 从 Develop 生成，不单独修改。精确校验还可查看同包的 SHA256SUMS.txt 与 release-manifest.json。</w:t>
       </w:r>
     </w:p>
     <w:tbl>
@@ -2180,7 +2180,7 @@
                 <w:b w:val="0"/>
                 <w:sz w:val="17"/>
               </w:rPr>
-              <w:t>D5FCB8CF9B929D0CBD39855DB1D850A2CAD93EC4127E4F39227710DA04BE2657</w:t>
+              <w:t>4571C93188F774B910EBAB4562114ED60276F8CBAD348BC31E4B40B634421030</w:t>
             </w:r>
             <w:bookmarkEnd w:id="100"/>
           </w:p>
@@ -2236,7 +2236,7 @@
                 <w:b w:val="0"/>
                 <w:sz w:val="17"/>
               </w:rPr>
-              <w:t>D16EFDCEF524A4C662B37162CFD83128A242480EB8F9421775F2659DED723590</w:t>
+              <w:t>A11DE50CC2C2EEAD42D74135AFA52A9EA3BBFC5AB56107B537C2D170D1393A6B</w:t>
             </w:r>
             <w:bookmarkEnd w:id="101"/>
           </w:p>
@@ -2292,7 +2292,7 @@
                 <w:b w:val="0"/>
                 <w:sz w:val="17"/>
               </w:rPr>
-              <w:t>4087522FEA9342876D3BF34EA46364E65507ED46065B02B40344D24CA5B6FB33</w:t>
+              <w:t>8523C6192F54C48FBBB0A548CC25A010EE2BC8B9057A989301FE53958AA40B91</w:t>
             </w:r>
             <w:bookmarkEnd w:id="102"/>
           </w:p>

</xml_diff>

<commit_message>
fix: close 2.7.0 viewport gaps and align regression contracts
</commit_message>
<xml_diff>
--- a/docs/Income-per-sed（说明文档）.docx
+++ b/docs/Income-per-sed（说明文档）.docx
@@ -12,7 +12,7 @@
     </w:p>
     <w:p>
       <w:r>
-        <w:t>产品版本 2.7.0 · 交付 20261021.3</w:t>
+        <w:t>产品版本 2.7.0 · 交付 20261021.4</w:t>
       </w:r>
     </w:p>
     <w:p>
@@ -974,7 +974,7 @@
       <w:r>
         <w:drawing>
           <wp:inline xmlns:a="http://schemas.openxmlformats.org/drawingml/2006/main" xmlns:pic="http://schemas.openxmlformats.org/drawingml/2006/picture">
-            <wp:extent cx="4800600" cy="3107055"/>
+            <wp:extent cx="4526280" cy="2929509"/>
             <wp:docPr id="3" name="Picture 3" descr="图 3 四个时间节点同时展开  当日工时随设置更新"/>
             <wp:cNvGraphicFramePr>
               <a:graphicFrameLocks noChangeAspect="1"/>
@@ -995,7 +995,7 @@
                   <pic:spPr>
                     <a:xfrm>
                       <a:off x="0" y="0"/>
-                      <a:ext cx="4800600" cy="3107055"/>
+                      <a:ext cx="4526280" cy="2929509"/>
                     </a:xfrm>
                     <a:prstGeom prst="rect"/>
                   </pic:spPr>
@@ -1022,7 +1022,7 @@
     </w:p>
     <w:p>
       <w:r>
-        <w:t>有效工时只累计上午与下午。默认 2 小时 30 分加 4 小时，共 6 小时 30 分。修改时段会同步影响时薪、秒薪和工作进度。</w:t>
+        <w:t>有效工时只累计上午与下午。默认 2 小时 30 分加 4 小时，共 6 小时 30 分。修改时段会同步影响时薪、秒薪和工作进度。键盘压缩空间时，可滚动设置内容；保存按钮保持可用。</w:t>
       </w:r>
     </w:p>
     <w:p>
@@ -2060,7 +2060,7 @@
     </w:p>
     <w:p>
       <w:r>
-        <w:t>网页、小组件与本手册统一为 2.7.0，交付 20261021.3。Develop 用于维护和诊断，日常使用 Push；Push 从 Develop 生成，不单独修改。精确校验还可查看同包的 SHA256SUMS.txt 与 release-manifest.json。</w:t>
+        <w:t>网页、小组件与本手册统一为 2.7.0，交付 20261021.4。Develop 用于维护和诊断，日常使用 Push；Push 从 Develop 生成，不单独修改。精确校验还可查看同包的 SHA256SUMS.txt 与 release-manifest.json。</w:t>
       </w:r>
     </w:p>
     <w:tbl>
@@ -2180,7 +2180,7 @@
                 <w:b w:val="0"/>
                 <w:sz w:val="17"/>
               </w:rPr>
-              <w:t>4571C93188F774B910EBAB4562114ED60276F8CBAD348BC31E4B40B634421030</w:t>
+              <w:t>31EFB7F2B2D093A3C78F27552AC885C9E943A49C0F4296C0A44518A8262837E7</w:t>
             </w:r>
             <w:bookmarkEnd w:id="100"/>
           </w:p>
@@ -2236,7 +2236,7 @@
                 <w:b w:val="0"/>
                 <w:sz w:val="17"/>
               </w:rPr>
-              <w:t>A11DE50CC2C2EEAD42D74135AFA52A9EA3BBFC5AB56107B537C2D170D1393A6B</w:t>
+              <w:t>7709428014B81F418E42BB88078A1113FFEE63EB56D36AAA358ACA3BE963F18A</w:t>
             </w:r>
             <w:bookmarkEnd w:id="101"/>
           </w:p>
@@ -2292,7 +2292,7 @@
                 <w:b w:val="0"/>
                 <w:sz w:val="17"/>
               </w:rPr>
-              <w:t>8523C6192F54C48FBBB0A548CC25A010EE2BC8B9057A989301FE53958AA40B91</w:t>
+              <w:t>10E52F65738EC19FB093AC36D6D38559FADECFCDFA401AA5515AE1F4B607FC00</w:t>
             </w:r>
             <w:bookmarkEnd w:id="102"/>
           </w:p>

</xml_diff>

<commit_message>
fix: ship 2.7.1 lightweight readouts and card expansion
</commit_message>
<xml_diff>
--- a/docs/Income-per-sed（说明文档）.docx
+++ b/docs/Income-per-sed（说明文档）.docx
@@ -12,7 +12,7 @@
     </w:p>
     <w:p>
       <w:r>
-        <w:t>产品版本 2.7.0 · 交付 20261021.4</w:t>
+        <w:t>产品版本 2.7.1 · 交付 20261022.1</w:t>
       </w:r>
     </w:p>
     <w:p>
@@ -530,7 +530,7 @@
     </w:p>
     <w:p>
       <w:r>
-        <w:t>中央滚轮保留机械质感，卡片里的金额与工时保持稳定对齐。单位略轻，卡片名称负责定位。编辑图标、悬停和按压反馈只提示“这里可操作”，不在每张卡片上重复说明文字。</w:t>
+        <w:t>中央滚轮保留连续的机械动效，普通工时读数随整秒变化，金额与工时保持稳定对齐。单位略轻，卡片名称负责定位；编辑图标、悬停和按压反馈提示可操作的位置。</w:t>
       </w:r>
     </w:p>
     <w:p>
@@ -548,7 +548,7 @@
     </w:p>
     <w:p>
       <w:r>
-        <w:t>点击“每小时收入”卡片进入设置。上方选择计薪方式，中间填写金额，下面即时给出折合时薪与日均收入。先核对结果，再点击保存。</w:t>
+        <w:t>点击“每小时收入”卡片进入设置。展开时原卡片暂时隐藏，关闭后回到原位。选择计薪方式、填写金额，下方即时给出折合时薪与日均收入；核对后保存。</w:t>
       </w:r>
     </w:p>
     <w:p>
@@ -941,10 +941,10 @@
         <w:rPr>
           <w:b/>
         </w:rPr>
-        <w:t>设计细节：</w:t>
+        <w:t>设计细节：面板从原卡片展开，只保留一层操作内容；输入与即时结果相邻，便于核对计薪口径。</w:t>
       </w:r>
       <w:r>
-        <w:t>把输入和结果放近，是为了让你马上判断“这是不是我想要的计薪口径”，而不是要求你先理解一长串公式。</w:t>
+        <w:t/>
       </w:r>
     </w:p>
     <w:p>
@@ -2060,7 +2060,7 @@
     </w:p>
     <w:p>
       <w:r>
-        <w:t>网页、小组件与本手册统一为 2.7.0，交付 20261021.4。Develop 用于维护和诊断，日常使用 Push；Push 从 Develop 生成，不单独修改。精确校验还可查看同包的 SHA256SUMS.txt 与 release-manifest.json。</w:t>
+        <w:t>网页、小组件与本手册统一为 2.7.1，交付 20261022.1。Develop 用于维护和诊断，日常使用 Push；Push 从 Develop 生成，不单独修改。精确校验还可查看同包的 SHA256SUMS.txt 与 release-manifest.json。</w:t>
       </w:r>
     </w:p>
     <w:tbl>
@@ -2180,7 +2180,7 @@
                 <w:b w:val="0"/>
                 <w:sz w:val="17"/>
               </w:rPr>
-              <w:t>31EFB7F2B2D093A3C78F27552AC885C9E943A49C0F4296C0A44518A8262837E7</w:t>
+              <w:t>C7BFB220A8096E122DF0AE69196F96F2A7E08309F689EEF3677965C53B55585C</w:t>
             </w:r>
             <w:bookmarkEnd w:id="100"/>
           </w:p>
@@ -2236,7 +2236,7 @@
                 <w:b w:val="0"/>
                 <w:sz w:val="17"/>
               </w:rPr>
-              <w:t>7709428014B81F418E42BB88078A1113FFEE63EB56D36AAA358ACA3BE963F18A</w:t>
+              <w:t>31F0053AC828D0D5B5A2971C9EDEAFECAEE45E1414E895DE699200659A0F0D2E</w:t>
             </w:r>
             <w:bookmarkEnd w:id="101"/>
           </w:p>
@@ -2292,7 +2292,7 @@
                 <w:b w:val="0"/>
                 <w:sz w:val="17"/>
               </w:rPr>
-              <w:t>10E52F65738EC19FB093AC36D6D38559FADECFCDFA401AA5515AE1F4B607FC00</w:t>
+              <w:t>4F2C2561ED3B8844BB12327B17D444AE4A56C4FBCFC9FCBC80BA5C215A2774DF</w:t>
             </w:r>
             <w:bookmarkEnd w:id="102"/>
           </w:p>
@@ -2309,7 +2309,7 @@
         <w:rPr>
           <w:sz w:val="20"/>
         </w:rPr>
-        <w:t>图片来源：图 1 至图 5 为本批 Push 的 Windows Edge 实际界面，2026 年 10 月 21 日采集；示例业务时间为 10 月 20 日 15:44，回溯与备份图另含示例操作，不是个人账单或手机实机图。</w:t>
+        <w:t>图片来源：图 1 至图 5 为本批 Push 的 Windows Edge 实际界面，2026 年 10 月 22 日采集；示例业务时间为 10 月 20 日 15:44，回溯与备份图另含示例操作，不是个人账单或手机实机图。</w:t>
       </w:r>
     </w:p>
     <w:p>

</xml_diff>

<commit_message>
fix: 2.7.1 lightweight readouts and card expansion (#60)
* fix: ship 2.7.1 lightweight readouts and card expansion

* fix: protect sampling inputs from aliased report paths

---------

Co-authored-by: userName <userEmail>
</commit_message>
<xml_diff>
--- a/docs/Income-per-sed（说明文档）.docx
+++ b/docs/Income-per-sed（说明文档）.docx
@@ -12,7 +12,7 @@
     </w:p>
     <w:p>
       <w:r>
-        <w:t>产品版本 2.7.0 · 交付 20261021.4</w:t>
+        <w:t>产品版本 2.7.1 · 交付 20261022.1</w:t>
       </w:r>
     </w:p>
     <w:p>
@@ -530,7 +530,7 @@
     </w:p>
     <w:p>
       <w:r>
-        <w:t>中央滚轮保留机械质感，卡片里的金额与工时保持稳定对齐。单位略轻，卡片名称负责定位。编辑图标、悬停和按压反馈只提示“这里可操作”，不在每张卡片上重复说明文字。</w:t>
+        <w:t>中央滚轮保留连续的机械动效，普通工时读数随整秒变化，金额与工时保持稳定对齐。单位略轻，卡片名称负责定位；编辑图标、悬停和按压反馈提示可操作的位置。</w:t>
       </w:r>
     </w:p>
     <w:p>
@@ -548,7 +548,7 @@
     </w:p>
     <w:p>
       <w:r>
-        <w:t>点击“每小时收入”卡片进入设置。上方选择计薪方式，中间填写金额，下面即时给出折合时薪与日均收入。先核对结果，再点击保存。</w:t>
+        <w:t>点击“每小时收入”卡片进入设置。展开时原卡片暂时隐藏，关闭后回到原位。选择计薪方式、填写金额，下方即时给出折合时薪与日均收入；核对后保存。</w:t>
       </w:r>
     </w:p>
     <w:p>
@@ -941,10 +941,10 @@
         <w:rPr>
           <w:b/>
         </w:rPr>
-        <w:t>设计细节：</w:t>
+        <w:t>设计细节：面板从原卡片展开，只保留一层操作内容；输入与即时结果相邻，便于核对计薪口径。</w:t>
       </w:r>
       <w:r>
-        <w:t>把输入和结果放近，是为了让你马上判断“这是不是我想要的计薪口径”，而不是要求你先理解一长串公式。</w:t>
+        <w:t/>
       </w:r>
     </w:p>
     <w:p>
@@ -2060,7 +2060,7 @@
     </w:p>
     <w:p>
       <w:r>
-        <w:t>网页、小组件与本手册统一为 2.7.0，交付 20261021.4。Develop 用于维护和诊断，日常使用 Push；Push 从 Develop 生成，不单独修改。精确校验还可查看同包的 SHA256SUMS.txt 与 release-manifest.json。</w:t>
+        <w:t>网页、小组件与本手册统一为 2.7.1，交付 20261022.1。Develop 用于维护和诊断，日常使用 Push；Push 从 Develop 生成，不单独修改。精确校验还可查看同包的 SHA256SUMS.txt 与 release-manifest.json。</w:t>
       </w:r>
     </w:p>
     <w:tbl>
@@ -2180,7 +2180,7 @@
                 <w:b w:val="0"/>
                 <w:sz w:val="17"/>
               </w:rPr>
-              <w:t>31EFB7F2B2D093A3C78F27552AC885C9E943A49C0F4296C0A44518A8262837E7</w:t>
+              <w:t>C7BFB220A8096E122DF0AE69196F96F2A7E08309F689EEF3677965C53B55585C</w:t>
             </w:r>
             <w:bookmarkEnd w:id="100"/>
           </w:p>
@@ -2236,7 +2236,7 @@
                 <w:b w:val="0"/>
                 <w:sz w:val="17"/>
               </w:rPr>
-              <w:t>7709428014B81F418E42BB88078A1113FFEE63EB56D36AAA358ACA3BE963F18A</w:t>
+              <w:t>31F0053AC828D0D5B5A2971C9EDEAFECAEE45E1414E895DE699200659A0F0D2E</w:t>
             </w:r>
             <w:bookmarkEnd w:id="101"/>
           </w:p>
@@ -2292,7 +2292,7 @@
                 <w:b w:val="0"/>
                 <w:sz w:val="17"/>
               </w:rPr>
-              <w:t>10E52F65738EC19FB093AC36D6D38559FADECFCDFA401AA5515AE1F4B607FC00</w:t>
+              <w:t>4F2C2561ED3B8844BB12327B17D444AE4A56C4FBCFC9FCBC80BA5C215A2774DF</w:t>
             </w:r>
             <w:bookmarkEnd w:id="102"/>
           </w:p>
@@ -2309,7 +2309,7 @@
         <w:rPr>
           <w:sz w:val="20"/>
         </w:rPr>
-        <w:t>图片来源：图 1 至图 5 为本批 Push 的 Windows Edge 实际界面，2026 年 10 月 21 日采集；示例业务时间为 10 月 20 日 15:44，回溯与备份图另含示例操作，不是个人账单或手机实机图。</w:t>
+        <w:t>图片来源：图 1 至图 5 为本批 Push 的 Windows Edge 实际界面，2026 年 10 月 22 日采集；示例业务时间为 10 月 20 日 15:44，回溯与备份图另含示例操作，不是个人账单或手机实机图。</w:t>
       </w:r>
     </w:p>
     <w:p>

</xml_diff>

<commit_message>
fix: deliver 2.7.2 history dial and responsive playback
</commit_message>
<xml_diff>
--- a/docs/Income-per-sed（说明文档）.docx
+++ b/docs/Income-per-sed（说明文档）.docx
@@ -12,7 +12,7 @@
     </w:p>
     <w:p>
       <w:r>
-        <w:t>产品版本 2.7.1 · 交付 20261022.1</w:t>
+        <w:t>产品版本 2.7.2 · 交付 20261023.1</w:t>
       </w:r>
     </w:p>
     <w:p>
@@ -560,7 +560,7 @@
       <w:r>
         <w:drawing>
           <wp:inline xmlns:a="http://schemas.openxmlformats.org/drawingml/2006/main" xmlns:pic="http://schemas.openxmlformats.org/drawingml/2006/picture">
-            <wp:extent cx="4114800" cy="3575155"/>
+            <wp:extent cx="4114800" cy="3575154"/>
             <wp:docPr id="2" name="Picture 2" descr="图 2 工资输入与即时结果放在同一张面板中"/>
             <wp:cNvGraphicFramePr>
               <a:graphicFrameLocks noChangeAspect="1"/>
@@ -581,7 +581,7 @@
                   <pic:spPr>
                     <a:xfrm>
                       <a:off x="0" y="0"/>
-                      <a:ext cx="4114800" cy="3575155"/>
+                      <a:ext cx="4114800" cy="3575154"/>
                     </a:xfrm>
                     <a:prstGeom prst="rect"/>
                   </pic:spPr>
@@ -1066,7 +1066,7 @@
     </w:p>
     <w:p>
       <w:r>
-        <w:t>点击顶部快速回溯按钮。左侧用 15 分钟、1 小时、4 小时和今日零点快速定位；右侧用日期与时间选择更具体的时刻，点击“回溯到所选时间”。可选范围受当前日历覆盖区间限制，不能选择未来。</w:t>
+        <w:t>点击顶部快速回溯按钮。全天拨盘标出上午、下午与实时位置，拖动外圈调整日内时刻；中心时间可输入时分秒。日期滚轮换日后点击“定位日期”，也可用 15 分钟、1 小时、4 小时和今日零点快速定位。不能选择未来。</w:t>
       </w:r>
     </w:p>
     <w:p>
@@ -1078,7 +1078,7 @@
       <w:r>
         <w:drawing>
           <wp:inline xmlns:a="http://schemas.openxmlformats.org/drawingml/2006/main" xmlns:pic="http://schemas.openxmlformats.org/drawingml/2006/picture">
-            <wp:extent cx="5669280" cy="3151453"/>
+            <wp:extent cx="4341341" cy="2834640"/>
             <wp:docPr id="4" name="Picture 4" descr="图 4 时间 日期与播放状态同处一张面板  回到实时是主要操作"/>
             <wp:cNvGraphicFramePr>
               <a:graphicFrameLocks noChangeAspect="1"/>
@@ -1099,7 +1099,7 @@
                   <pic:spPr>
                     <a:xfrm>
                       <a:off x="0" y="0"/>
-                      <a:ext cx="5669280" cy="3151453"/>
+                      <a:ext cx="4341341" cy="2834640"/>
                     </a:xfrm>
                     <a:prstGeom prst="rect"/>
                   </pic:spPr>
@@ -1116,7 +1116,7 @@
         <w:jc w:val="center"/>
       </w:pPr>
       <w:r>
-        <w:t>图 4 时间 日期与播放状态同处一张面板  回到实时是主要操作</w:t>
+        <w:t>图 4 全天拨盘与日期定位同处一张面板  右侧播放 左侧返回实时</w:t>
       </w:r>
     </w:p>
     <w:p>
@@ -1129,7 +1129,7 @@
     </w:p>
     <w:p>
       <w:r>
-        <w:t>定位后会停在所选时刻。播放按钮让历史时间继续推进，暂停按钮将它停住；“回到实时”恢复当前时间，但不会擅自关闭面板。右上角关闭只收起面板，不等于退出历史状态，主界面仍保留相应日期与状态。</w:t>
+        <w:t>定位后停在所选时刻。右侧播放按钮继续推进历史时间，再按一次暂停；左侧回转图标返回实时，面板保持打开。关闭只收起面板，不退出历史状态。时间输错时会保留原值和提示，修正后再提交；按 Esc 可放弃编辑。</w:t>
       </w:r>
     </w:p>
     <w:p>
@@ -2060,7 +2060,7 @@
     </w:p>
     <w:p>
       <w:r>
-        <w:t>网页、小组件与本手册统一为 2.7.1，交付 20261022.1。Develop 用于维护和诊断，日常使用 Push；Push 从 Develop 生成，不单独修改。精确校验还可查看同包的 SHA256SUMS.txt 与 release-manifest.json。</w:t>
+        <w:t>网页、小组件与本手册统一为 2.7.2，交付 20261023.1。Develop 用于维护和诊断，日常使用 Push；Push 从 Develop 生成，不单独修改。精确校验还可查看同包的 SHA256SUMS.txt 与 release-manifest.json。</w:t>
       </w:r>
     </w:p>
     <w:tbl>
@@ -2180,7 +2180,7 @@
                 <w:b w:val="0"/>
                 <w:sz w:val="17"/>
               </w:rPr>
-              <w:t>C7BFB220A8096E122DF0AE69196F96F2A7E08309F689EEF3677965C53B55585C</w:t>
+              <w:t>72F741AD086BC303271046E380C378545E6C1BF39B429AA8B5DACA88041F780D</w:t>
             </w:r>
             <w:bookmarkEnd w:id="100"/>
           </w:p>
@@ -2236,7 +2236,7 @@
                 <w:b w:val="0"/>
                 <w:sz w:val="17"/>
               </w:rPr>
-              <w:t>31F0053AC828D0D5B5A2971C9EDEAFECAEE45E1414E895DE699200659A0F0D2E</w:t>
+              <w:t>0866382F651EE4032D3F92280743444B2660C916890D95BB9C786EF9C1A97A82</w:t>
             </w:r>
             <w:bookmarkEnd w:id="101"/>
           </w:p>
@@ -2292,7 +2292,7 @@
                 <w:b w:val="0"/>
                 <w:sz w:val="17"/>
               </w:rPr>
-              <w:t>4F2C2561ED3B8844BB12327B17D444AE4A56C4FBCFC9FCBC80BA5C215A2774DF</w:t>
+              <w:t>7FC27B03409568BC2066D03E80D5FA5230C2E65A334D0F40F16106AF9FD07E55</w:t>
             </w:r>
             <w:bookmarkEnd w:id="102"/>
           </w:p>
@@ -2309,7 +2309,7 @@
         <w:rPr>
           <w:sz w:val="20"/>
         </w:rPr>
-        <w:t>图片来源：图 1 至图 5 为本批 Push 的 Windows Edge 实际界面，2026 年 10 月 22 日采集；示例业务时间为 10 月 20 日 15:44，回溯与备份图另含示例操作，不是个人账单或手机实机图。</w:t>
+        <w:t>图片来源：图 1 至图 5 为本批 Push 的 Windows Edge 实际界面，2026 年 10 月 23 日采集；示例业务时间为 10 月 20 日 15:44，回溯与备份图另含示例操作，不是个人账单或手机实机图。</w:t>
       </w:r>
     </w:p>
     <w:p>

</xml_diff>

<commit_message>
fix: preserve pending dial time across submit focus handoff
</commit_message>
<xml_diff>
--- a/docs/Income-per-sed（说明文档）.docx
+++ b/docs/Income-per-sed（说明文档）.docx
@@ -2180,7 +2180,7 @@
                 <w:b w:val="0"/>
                 <w:sz w:val="17"/>
               </w:rPr>
-              <w:t>72F741AD086BC303271046E380C378545E6C1BF39B429AA8B5DACA88041F780D</w:t>
+              <w:t>ED7C0023F2EB55BCC5C2A16E81CC37F59522D08C69EC2FA3E44E4A3A3CBD3260</w:t>
             </w:r>
             <w:bookmarkEnd w:id="100"/>
           </w:p>
@@ -2236,7 +2236,7 @@
                 <w:b w:val="0"/>
                 <w:sz w:val="17"/>
               </w:rPr>
-              <w:t>0866382F651EE4032D3F92280743444B2660C916890D95BB9C786EF9C1A97A82</w:t>
+              <w:t>D8A1C68E5F9B3FB809FAEDEFC1F1EE59B4A88AE9B82C88E62F81B720EE033D17</w:t>
             </w:r>
             <w:bookmarkEnd w:id="101"/>
           </w:p>

</xml_diff>

<commit_message>
chore: record local eight-batch CSS cleanup verification
</commit_message>
<xml_diff>
--- a/docs/Income-per-sed（说明文档）.docx
+++ b/docs/Income-per-sed（说明文档）.docx
@@ -2180,7 +2180,7 @@
                 <w:b w:val="0"/>
                 <w:sz w:val="17"/>
               </w:rPr>
-              <w:t>ED7C0023F2EB55BCC5C2A16E81CC37F59522D08C69EC2FA3E44E4A3A3CBD3260</w:t>
+              <w:t>E35C18F2DEE1A62DD76A56AFCD3FD4564A05A5066A88CD5A353C3BDD3C9184D3</w:t>
             </w:r>
             <w:bookmarkEnd w:id="100"/>
           </w:p>
@@ -2236,7 +2236,7 @@
                 <w:b w:val="0"/>
                 <w:sz w:val="17"/>
               </w:rPr>
-              <w:t>D8A1C68E5F9B3FB809FAEDEFC1F1EE59B4A88AE9B82C88E62F81B720EE033D17</w:t>
+              <w:t>95B3BA5B7ECE2F32BF04C2BDBA50219BF71C8FD8D4D2435033EB0E69252F823C</w:t>
             </w:r>
             <w:bookmarkEnd w:id="101"/>
           </w:p>

</xml_diff>

<commit_message>
chore: record local global CSS audit verification
</commit_message>
<xml_diff>
--- a/docs/Income-per-sed（说明文档）.docx
+++ b/docs/Income-per-sed（说明文档）.docx
@@ -2180,7 +2180,7 @@
                 <w:b w:val="0"/>
                 <w:sz w:val="17"/>
               </w:rPr>
-              <w:t>E35C18F2DEE1A62DD76A56AFCD3FD4564A05A5066A88CD5A353C3BDD3C9184D3</w:t>
+              <w:t>667BD5B748DE940D2CDB0D1F2391F14492E47CC190C4053AD95A02F33178AA60</w:t>
             </w:r>
             <w:bookmarkEnd w:id="100"/>
           </w:p>
@@ -2236,7 +2236,7 @@
                 <w:b w:val="0"/>
                 <w:sz w:val="17"/>
               </w:rPr>
-              <w:t>95B3BA5B7ECE2F32BF04C2BDBA50219BF71C8FD8D4D2435033EB0E69252F823C</w:t>
+              <w:t>D0F785BC0B195994BDFFE5C44F4797D487E5480F735316B6FF2787E7191E0AA2</w:t>
             </w:r>
             <w:bookmarkEnd w:id="101"/>
           </w:p>

</xml_diff>

<commit_message>
docs: record variable cleanup and marker preview verification
</commit_message>
<xml_diff>
--- a/docs/Income-per-sed（说明文档）.docx
+++ b/docs/Income-per-sed（说明文档）.docx
@@ -2180,7 +2180,7 @@
                 <w:b w:val="0"/>
                 <w:sz w:val="17"/>
               </w:rPr>
-              <w:t>667BD5B748DE940D2CDB0D1F2391F14492E47CC190C4053AD95A02F33178AA60</w:t>
+              <w:t>3FE46C301C96A0794966CA8C543D7747FC5530EE56B3DEF1402883C57DA7BF73</w:t>
             </w:r>
             <w:bookmarkEnd w:id="100"/>
           </w:p>
@@ -2236,7 +2236,7 @@
                 <w:b w:val="0"/>
                 <w:sz w:val="17"/>
               </w:rPr>
-              <w:t>D0F785BC0B195994BDFFE5C44F4797D487E5480F735316B6FF2787E7191E0AA2</w:t>
+              <w:t>E16287DC0B4E6F5DC1C4744E0D7A81D7AC78A364E334389D7224CEC7285A5B26</w:t>
             </w:r>
             <w:bookmarkEnd w:id="101"/>
           </w:p>

</xml_diff>

<commit_message>
docs: record WebKit investigation and second variable cleanup
</commit_message>
<xml_diff>
--- a/docs/Income-per-sed（说明文档）.docx
+++ b/docs/Income-per-sed（说明文档）.docx
@@ -2180,7 +2180,7 @@
                 <w:b w:val="0"/>
                 <w:sz w:val="17"/>
               </w:rPr>
-              <w:t>3FE46C301C96A0794966CA8C543D7747FC5530EE56B3DEF1402883C57DA7BF73</w:t>
+              <w:t>11B24D9B1141464F1182BA06E9AADC41C128013D49A6226F929E34B9B3FCDD1E</w:t>
             </w:r>
             <w:bookmarkEnd w:id="100"/>
           </w:p>
@@ -2236,7 +2236,7 @@
                 <w:b w:val="0"/>
                 <w:sz w:val="17"/>
               </w:rPr>
-              <w:t>E16287DC0B4E6F5DC1C4744E0D7A81D7AC78A364E334389D7224CEC7285A5B26</w:t>
+              <w:t>9E431E963CF03702904688DCF3183BFC0330000ABA0CE13563807BBF60DDECE5</w:t>
             </w:r>
             <w:bookmarkEnd w:id="101"/>
           </w:p>

</xml_diff>

<commit_message>
docs: record staged display and color variable cleanup
</commit_message>
<xml_diff>
--- a/docs/Income-per-sed（说明文档）.docx
+++ b/docs/Income-per-sed（说明文档）.docx
@@ -2180,7 +2180,7 @@
                 <w:b w:val="0"/>
                 <w:sz w:val="17"/>
               </w:rPr>
-              <w:t>11B24D9B1141464F1182BA06E9AADC41C128013D49A6226F929E34B9B3FCDD1E</w:t>
+              <w:t>BE3A7F4C3E21F69E5D2A0C8E1CD375B5DF4CC43E598A2F20F75A7C027627B83C</w:t>
             </w:r>
             <w:bookmarkEnd w:id="100"/>
           </w:p>
@@ -2236,7 +2236,7 @@
                 <w:b w:val="0"/>
                 <w:sz w:val="17"/>
               </w:rPr>
-              <w:t>9E431E963CF03702904688DCF3183BFC0330000ABA0CE13563807BBF60DDECE5</w:t>
+              <w:t>3420AFCADE89D7535C4D39C944569324412728561A6CDBF6FE6B93CE8C1BC70A</w:t>
             </w:r>
             <w:bookmarkEnd w:id="101"/>
           </w:p>

</xml_diff>

<commit_message>
docs: record full regression failures after alias cleanup
</commit_message>
<xml_diff>
--- a/docs/Income-per-sed（说明文档）.docx
+++ b/docs/Income-per-sed（说明文档）.docx
@@ -2180,7 +2180,7 @@
                 <w:b w:val="0"/>
                 <w:sz w:val="17"/>
               </w:rPr>
-              <w:t>BE3A7F4C3E21F69E5D2A0C8E1CD375B5DF4CC43E598A2F20F75A7C027627B83C</w:t>
+              <w:t>89866292EDF7CED31183230EBB9C19856CF8488076AE3EC951114F5E8AFC5D58</w:t>
             </w:r>
             <w:bookmarkEnd w:id="100"/>
           </w:p>
@@ -2236,7 +2236,7 @@
                 <w:b w:val="0"/>
                 <w:sz w:val="17"/>
               </w:rPr>
-              <w:t>3420AFCADE89D7535C4D39C944569324412728561A6CDBF6FE6B93CE8C1BC70A</w:t>
+              <w:t>2472C55CE53A1047761785947CDD4651A8C5D6FEDAE1C9ACD08163AC5CC8CD50</w:t>
             </w:r>
             <w:bookmarkEnd w:id="101"/>
           </w:p>

</xml_diff>

<commit_message>
refactor(css): remove shadowed keyframe definitions
</commit_message>
<xml_diff>
--- a/docs/Income-per-sed（说明文档）.docx
+++ b/docs/Income-per-sed（说明文档）.docx
@@ -2180,7 +2180,7 @@
                 <w:b w:val="0"/>
                 <w:sz w:val="17"/>
               </w:rPr>
-              <w:t>89866292EDF7CED31183230EBB9C19856CF8488076AE3EC951114F5E8AFC5D58</w:t>
+              <w:t>271C359E2010EDC315D0CA64F4B746E38BA780A47727AD3BD5D4318413CE1DC0</w:t>
             </w:r>
             <w:bookmarkEnd w:id="100"/>
           </w:p>
@@ -2236,7 +2236,7 @@
                 <w:b w:val="0"/>
                 <w:sz w:val="17"/>
               </w:rPr>
-              <w:t>2472C55CE53A1047761785947CDD4651A8C5D6FEDAE1C9ACD08163AC5CC8CD50</w:t>
+              <w:t>A8791EBC60469910C235F8A8398F031CB305EEA9127A2562F87078985815288B</w:t>
             </w:r>
             <w:bookmarkEnd w:id="101"/>
           </w:p>

</xml_diff>

<commit_message>
perf: skip unchanged timeline label writes
</commit_message>
<xml_diff>
--- a/docs/Income-per-sed（说明文档）.docx
+++ b/docs/Income-per-sed（说明文档）.docx
@@ -2180,7 +2180,7 @@
                 <w:b w:val="0"/>
                 <w:sz w:val="17"/>
               </w:rPr>
-              <w:t>271C359E2010EDC315D0CA64F4B746E38BA780A47727AD3BD5D4318413CE1DC0</w:t>
+              <w:t>92C1087490B9DA82DF0CF3E989D4A49FE7EB72A016BC6E380268EE834EBC145F</w:t>
             </w:r>
             <w:bookmarkEnd w:id="100"/>
           </w:p>
@@ -2236,7 +2236,7 @@
                 <w:b w:val="0"/>
                 <w:sz w:val="17"/>
               </w:rPr>
-              <w:t>A8791EBC60469910C235F8A8398F031CB305EEA9127A2562F87078985815288B</w:t>
+              <w:t>8EB85F8071CC74C4C09D0B7410C1672FC68A85FCA6B10C64E129F6D6A24E4548</w:t>
             </w:r>
             <w:bookmarkEnd w:id="101"/>
           </w:p>

</xml_diff>

<commit_message>
perf: reuse frame-local timeline time formatting
</commit_message>
<xml_diff>
--- a/docs/Income-per-sed（说明文档）.docx
+++ b/docs/Income-per-sed（说明文档）.docx
@@ -2180,7 +2180,7 @@
                 <w:b w:val="0"/>
                 <w:sz w:val="17"/>
               </w:rPr>
-              <w:t>92C1087490B9DA82DF0CF3E989D4A49FE7EB72A016BC6E380268EE834EBC145F</w:t>
+              <w:t>875C85627A3A6CFAEE45DA20369934B8B230D0A112D4439867CBD730F1568980</w:t>
             </w:r>
             <w:bookmarkEnd w:id="100"/>
           </w:p>
@@ -2236,7 +2236,7 @@
                 <w:b w:val="0"/>
                 <w:sz w:val="17"/>
               </w:rPr>
-              <w:t>8EB85F8071CC74C4C09D0B7410C1672FC68A85FCA6B10C64E129F6D6A24E4548</w:t>
+              <w:t>1E8AE1E784C32D05214DB0DF72B80D5CEBCC8697C173BAB29C6EB2A216F28EEC</w:t>
             </w:r>
             <w:bookmarkEnd w:id="101"/>
           </w:p>

</xml_diff>

<commit_message>
release: synchronize 2.7.3 lightweight delivery
</commit_message>
<xml_diff>
--- a/docs/Income-per-sed（说明文档）.docx
+++ b/docs/Income-per-sed（说明文档）.docx
@@ -12,7 +12,7 @@
     </w:p>
     <w:p>
       <w:r>
-        <w:t>产品版本 2.7.2 · 交付 20261023.1</w:t>
+        <w:t>产品版本 2.7.3 · 交付 20261026.1</w:t>
       </w:r>
     </w:p>
     <w:p>
@@ -2060,7 +2060,7 @@
     </w:p>
     <w:p>
       <w:r>
-        <w:t>网页、小组件与本手册统一为 2.7.2，交付 20261023.1。Develop 用于维护和诊断，日常使用 Push；Push 从 Develop 生成，不单独修改。精确校验还可查看同包的 SHA256SUMS.txt 与 release-manifest.json。</w:t>
+        <w:t>网页、小组件与本手册统一为 2.7.3，交付 20261026.1。Develop 用于维护和诊断，日常使用 Push；Push 从 Develop 生成，不单独修改。精确校验还可查看同包的 SHA256SUMS.txt 与 release-manifest.json。</w:t>
       </w:r>
     </w:p>
     <w:tbl>
@@ -2180,7 +2180,7 @@
                 <w:b w:val="0"/>
                 <w:sz w:val="17"/>
               </w:rPr>
-              <w:t>875C85627A3A6CFAEE45DA20369934B8B230D0A112D4439867CBD730F1568980</w:t>
+              <w:t>8863D926EE0EB36D59BF3E4C3F7655D453DD2645E6BD126EEA433EE47F4CA1ED</w:t>
             </w:r>
             <w:bookmarkEnd w:id="100"/>
           </w:p>
@@ -2236,7 +2236,7 @@
                 <w:b w:val="0"/>
                 <w:sz w:val="17"/>
               </w:rPr>
-              <w:t>1E8AE1E784C32D05214DB0DF72B80D5CEBCC8697C173BAB29C6EB2A216F28EEC</w:t>
+              <w:t>6D1C335C0F9719E38CC1C2F863C00498C32EA9BA9F9BF5FA582E2DA47EABE108</w:t>
             </w:r>
             <w:bookmarkEnd w:id="101"/>
           </w:p>
@@ -2292,7 +2292,7 @@
                 <w:b w:val="0"/>
                 <w:sz w:val="17"/>
               </w:rPr>
-              <w:t>7FC27B03409568BC2066D03E80D5FA5230C2E65A334D0F40F16106AF9FD07E55</w:t>
+              <w:t>A6B191B0899CFF0ACBA0E395609E79F48B33CAAE9AC68AA7EF598AC11B51450C</w:t>
             </w:r>
             <w:bookmarkEnd w:id="102"/>
           </w:p>
@@ -2309,7 +2309,7 @@
         <w:rPr>
           <w:sz w:val="20"/>
         </w:rPr>
-        <w:t>图片来源：图 1 至图 5 为本批 Push 的 Windows Edge 实际界面，2026 年 10 月 23 日采集；示例业务时间为 10 月 20 日 15:44，回溯与备份图另含示例操作，不是个人账单或手机实机图。</w:t>
+        <w:t>图片来源：图 1 至图 5 为2.7.2 Push 的 Windows Edge 实际界面，2026 年 10 月 23 日采集；示例业务时间为 10 月 20 日 15:44，回溯与备份图另含示例操作，不是个人账单或手机实机图。</w:t>
       </w:r>
     </w:p>
     <w:p>

</xml_diff>

<commit_message>
release: deliver 2.7.4 history placement optimization
</commit_message>
<xml_diff>
--- a/docs/Income-per-sed（说明文档）.docx
+++ b/docs/Income-per-sed（说明文档）.docx
@@ -12,7 +12,7 @@
     </w:p>
     <w:p>
       <w:r>
-        <w:t>产品版本 2.7.3 · 交付 20261026.1</w:t>
+        <w:t>产品版本 2.7.4 · 交付 20261027.1</w:t>
       </w:r>
     </w:p>
     <w:p>
@@ -2060,7 +2060,7 @@
     </w:p>
     <w:p>
       <w:r>
-        <w:t>网页、小组件与本手册统一为 2.7.3，交付 20261026.1。Develop 用于维护和诊断，日常使用 Push；Push 从 Develop 生成，不单独修改。精确校验还可查看同包的 SHA256SUMS.txt 与 release-manifest.json。</w:t>
+        <w:t>网页、小组件与本手册统一为 2.7.4，交付 20261027.1。Develop 用于维护和诊断，日常使用 Push；Push 从 Develop 生成，不单独修改。精确校验还可查看同包的 SHA256SUMS.txt 与 release-manifest.json。</w:t>
       </w:r>
     </w:p>
     <w:tbl>
@@ -2180,7 +2180,7 @@
                 <w:b w:val="0"/>
                 <w:sz w:val="17"/>
               </w:rPr>
-              <w:t>8863D926EE0EB36D59BF3E4C3F7655D453DD2645E6BD126EEA433EE47F4CA1ED</w:t>
+              <w:t>1566D0B550F0A84714AA0C5F6848C5EE34310CB705E93112CB5BB8603862BE57</w:t>
             </w:r>
             <w:bookmarkEnd w:id="100"/>
           </w:p>
@@ -2236,7 +2236,7 @@
                 <w:b w:val="0"/>
                 <w:sz w:val="17"/>
               </w:rPr>
-              <w:t>6D1C335C0F9719E38CC1C2F863C00498C32EA9BA9F9BF5FA582E2DA47EABE108</w:t>
+              <w:t>62FBDAE9DDDEAEB1BFB8B0CCF4A1CBBE29D8B862CB4EA09D8DB15FD9FF1E6FA6</w:t>
             </w:r>
             <w:bookmarkEnd w:id="101"/>
           </w:p>
@@ -2292,7 +2292,7 @@
                 <w:b w:val="0"/>
                 <w:sz w:val="17"/>
               </w:rPr>
-              <w:t>A6B191B0899CFF0ACBA0E395609E79F48B33CAAE9AC68AA7EF598AC11B51450C</w:t>
+              <w:t>9F74B4D1548AC1B90BC86DE11B11C3B3A908CEAECC813A0242E36D26515A75CE</w:t>
             </w:r>
             <w:bookmarkEnd w:id="102"/>
           </w:p>

</xml_diff>

<commit_message>
release: deliver 2.7.4 history placement optimization (#66)
Co-authored-by: userName <userEmail>
</commit_message>
<xml_diff>
--- a/docs/Income-per-sed（说明文档）.docx
+++ b/docs/Income-per-sed（说明文档）.docx
@@ -12,7 +12,7 @@
     </w:p>
     <w:p>
       <w:r>
-        <w:t>产品版本 2.7.3 · 交付 20261026.1</w:t>
+        <w:t>产品版本 2.7.4 · 交付 20261027.1</w:t>
       </w:r>
     </w:p>
     <w:p>
@@ -2060,7 +2060,7 @@
     </w:p>
     <w:p>
       <w:r>
-        <w:t>网页、小组件与本手册统一为 2.7.3，交付 20261026.1。Develop 用于维护和诊断，日常使用 Push；Push 从 Develop 生成，不单独修改。精确校验还可查看同包的 SHA256SUMS.txt 与 release-manifest.json。</w:t>
+        <w:t>网页、小组件与本手册统一为 2.7.4，交付 20261027.1。Develop 用于维护和诊断，日常使用 Push；Push 从 Develop 生成，不单独修改。精确校验还可查看同包的 SHA256SUMS.txt 与 release-manifest.json。</w:t>
       </w:r>
     </w:p>
     <w:tbl>
@@ -2180,7 +2180,7 @@
                 <w:b w:val="0"/>
                 <w:sz w:val="17"/>
               </w:rPr>
-              <w:t>8863D926EE0EB36D59BF3E4C3F7655D453DD2645E6BD126EEA433EE47F4CA1ED</w:t>
+              <w:t>1566D0B550F0A84714AA0C5F6848C5EE34310CB705E93112CB5BB8603862BE57</w:t>
             </w:r>
             <w:bookmarkEnd w:id="100"/>
           </w:p>
@@ -2236,7 +2236,7 @@
                 <w:b w:val="0"/>
                 <w:sz w:val="17"/>
               </w:rPr>
-              <w:t>6D1C335C0F9719E38CC1C2F863C00498C32EA9BA9F9BF5FA582E2DA47EABE108</w:t>
+              <w:t>62FBDAE9DDDEAEB1BFB8B0CCF4A1CBBE29D8B862CB4EA09D8DB15FD9FF1E6FA6</w:t>
             </w:r>
             <w:bookmarkEnd w:id="101"/>
           </w:p>
@@ -2292,7 +2292,7 @@
                 <w:b w:val="0"/>
                 <w:sz w:val="17"/>
               </w:rPr>
-              <w:t>A6B191B0899CFF0ACBA0E395609E79F48B33CAAE9AC68AA7EF598AC11B51450C</w:t>
+              <w:t>9F74B4D1548AC1B90BC86DE11B11C3B3A908CEAECC813A0242E36D26515A75CE</w:t>
             </w:r>
             <w:bookmarkEnd w:id="102"/>
           </w:p>

</xml_diff>

<commit_message>
fix: keep history return progress on one route
</commit_message>
<xml_diff>
--- a/docs/Income-per-sed（说明文档）.docx
+++ b/docs/Income-per-sed（说明文档）.docx
@@ -2180,7 +2180,7 @@
                 <w:b w:val="0"/>
                 <w:sz w:val="17"/>
               </w:rPr>
-              <w:t>1566D0B550F0A84714AA0C5F6848C5EE34310CB705E93112CB5BB8603862BE57</w:t>
+              <w:t>3371DFBE23DBCF3804BDDDA4F88879D62D30321831FF29E1AC2249F67A3CEEAE</w:t>
             </w:r>
             <w:bookmarkEnd w:id="100"/>
           </w:p>
@@ -2236,7 +2236,7 @@
                 <w:b w:val="0"/>
                 <w:sz w:val="17"/>
               </w:rPr>
-              <w:t>62FBDAE9DDDEAEB1BFB8B0CCF4A1CBBE29D8B862CB4EA09D8DB15FD9FF1E6FA6</w:t>
+              <w:t>6706B33C80822CF05C65FA6806F7455C5C58EB854CDCCDA8C1B0D627C8234F85</w:t>
             </w:r>
             <w:bookmarkEnd w:id="101"/>
           </w:p>

</xml_diff>

<commit_message>
chore: checkpoint 2.7.5 candidate with acceptance blocked
</commit_message>
<xml_diff>
--- a/docs/Income-per-sed（说明文档）.docx
+++ b/docs/Income-per-sed（说明文档）.docx
@@ -12,7 +12,7 @@
     </w:p>
     <w:p>
       <w:r>
-        <w:t>产品版本 2.7.4 · 交付 20261027.1</w:t>
+        <w:t>产品版本 2.7.5 · 交付 20261028.1</w:t>
       </w:r>
     </w:p>
     <w:p>
@@ -2060,7 +2060,7 @@
     </w:p>
     <w:p>
       <w:r>
-        <w:t>网页、小组件与本手册统一为 2.7.4，交付 20261027.1。Develop 用于维护和诊断，日常使用 Push；Push 从 Develop 生成，不单独修改。精确校验还可查看同包的 SHA256SUMS.txt 与 release-manifest.json。</w:t>
+        <w:t>网页、小组件与本手册统一为 2.7.5，交付 20261028.1。Develop 用于维护和诊断，日常使用 Push；Push 从 Develop 生成，不单独修改。精确校验还可查看同包的 SHA256SUMS.txt 与 release-manifest.json。</w:t>
       </w:r>
     </w:p>
     <w:tbl>
@@ -2180,7 +2180,7 @@
                 <w:b w:val="0"/>
                 <w:sz w:val="17"/>
               </w:rPr>
-              <w:t>3371DFBE23DBCF3804BDDDA4F88879D62D30321831FF29E1AC2249F67A3CEEAE</w:t>
+              <w:t>602021B1D8F60DB1D7820235B56EBED28B7E0DCBEC948D2230D53532BCA01EAC</w:t>
             </w:r>
             <w:bookmarkEnd w:id="100"/>
           </w:p>
@@ -2236,7 +2236,7 @@
                 <w:b w:val="0"/>
                 <w:sz w:val="17"/>
               </w:rPr>
-              <w:t>6706B33C80822CF05C65FA6806F7455C5C58EB854CDCCDA8C1B0D627C8234F85</w:t>
+              <w:t>1DACA10ACB51A97801ABD0A2C3EAEF2E594978C8517ED16119C0458B6EB0C81B</w:t>
             </w:r>
             <w:bookmarkEnd w:id="101"/>
           </w:p>
@@ -2292,7 +2292,7 @@
                 <w:b w:val="0"/>
                 <w:sz w:val="17"/>
               </w:rPr>
-              <w:t>9F74B4D1548AC1B90BC86DE11B11C3B3A908CEAECC813A0242E36D26515A75CE</w:t>
+              <w:t>1C30A00321768E9E7C98E5644F6B41750FE3C8AFB307C21857D0763327F600AF</w:t>
             </w:r>
             <w:bookmarkEnd w:id="102"/>
           </w:p>

</xml_diff>

<commit_message>
fix: preserve main-hand phase at foreground handoff
</commit_message>
<xml_diff>
--- a/docs/Income-per-sed（说明文档）.docx
+++ b/docs/Income-per-sed（说明文档）.docx
@@ -2180,7 +2180,7 @@
                 <w:b w:val="0"/>
                 <w:sz w:val="17"/>
               </w:rPr>
-              <w:t>602021B1D8F60DB1D7820235B56EBED28B7E0DCBEC948D2230D53532BCA01EAC</w:t>
+              <w:t>2F91DCEF15FCE8020FAE425599985F3B8C2C3FEA1E7668BA66E6088E92BBD5A6</w:t>
             </w:r>
             <w:bookmarkEnd w:id="100"/>
           </w:p>
@@ -2236,7 +2236,7 @@
                 <w:b w:val="0"/>
                 <w:sz w:val="17"/>
               </w:rPr>
-              <w:t>1DACA10ACB51A97801ABD0A2C3EAEF2E594978C8517ED16119C0458B6EB0C81B</w:t>
+              <w:t>1F27358B70267EA1517D8A813C051CDB055C729FDDED96BA5EB0753166897A14</w:t>
             </w:r>
             <w:bookmarkEnd w:id="101"/>
           </w:p>

</xml_diff>

<commit_message>
fix: align lunch return progress for 2.7.5 (#71)
* fix: keep history return progress on one route

* chore: checkpoint 2.7.5 candidate with acceptance blocked

* fix: preserve main-hand phase at foreground handoff

---------

Co-authored-by: userName <userEmail>
</commit_message>
<xml_diff>
--- a/docs/Income-per-sed（说明文档）.docx
+++ b/docs/Income-per-sed（说明文档）.docx
@@ -12,7 +12,7 @@
     </w:p>
     <w:p>
       <w:r>
-        <w:t>产品版本 2.7.4 · 交付 20261027.1</w:t>
+        <w:t>产品版本 2.7.5 · 交付 20261028.1</w:t>
       </w:r>
     </w:p>
     <w:p>
@@ -2060,7 +2060,7 @@
     </w:p>
     <w:p>
       <w:r>
-        <w:t>网页、小组件与本手册统一为 2.7.4，交付 20261027.1。Develop 用于维护和诊断，日常使用 Push；Push 从 Develop 生成，不单独修改。精确校验还可查看同包的 SHA256SUMS.txt 与 release-manifest.json。</w:t>
+        <w:t>网页、小组件与本手册统一为 2.7.5，交付 20261028.1。Develop 用于维护和诊断，日常使用 Push；Push 从 Develop 生成，不单独修改。精确校验还可查看同包的 SHA256SUMS.txt 与 release-manifest.json。</w:t>
       </w:r>
     </w:p>
     <w:tbl>
@@ -2180,7 +2180,7 @@
                 <w:b w:val="0"/>
                 <w:sz w:val="17"/>
               </w:rPr>
-              <w:t>1566D0B550F0A84714AA0C5F6848C5EE34310CB705E93112CB5BB8603862BE57</w:t>
+              <w:t>2F91DCEF15FCE8020FAE425599985F3B8C2C3FEA1E7668BA66E6088E92BBD5A6</w:t>
             </w:r>
             <w:bookmarkEnd w:id="100"/>
           </w:p>
@@ -2236,7 +2236,7 @@
                 <w:b w:val="0"/>
                 <w:sz w:val="17"/>
               </w:rPr>
-              <w:t>62FBDAE9DDDEAEB1BFB8B0CCF4A1CBBE29D8B862CB4EA09D8DB15FD9FF1E6FA6</w:t>
+              <w:t>1F27358B70267EA1517D8A813C051CDB055C729FDDED96BA5EB0753166897A14</w:t>
             </w:r>
             <w:bookmarkEnd w:id="101"/>
           </w:p>
@@ -2292,7 +2292,7 @@
                 <w:b w:val="0"/>
                 <w:sz w:val="17"/>
               </w:rPr>
-              <w:t>9F74B4D1548AC1B90BC86DE11B11C3B3A908CEAECC813A0242E36D26515A75CE</w:t>
+              <w:t>1C30A00321768E9E7C98E5644F6B41750FE3C8AFB307C21857D0763327F600AF</w:t>
             </w:r>
             <w:bookmarkEnd w:id="102"/>
           </w:p>

</xml_diff>